<commit_message>
docs: some changes in the article
</commit_message>
<xml_diff>
--- a/07-week/02-session/02-activity/Articulo de investigación.docx
+++ b/07-week/02-session/02-activity/Articulo de investigación.docx
@@ -889,14 +889,7 @@
           <w:b/>
           <w:bCs/>
         </w:rPr>
-        <w:t xml:space="preserve"> </w:t>
-      </w:r>
-      <w:r>
-        <w:rPr>
-          <w:b/>
-          <w:bCs/>
-        </w:rPr>
-        <w:t>Análisis cualitativo de la evidencia (síntesis del thesaurus)</w:t>
+        <w:t xml:space="preserve"> Análisis cualitativo de la evidencia (síntesis del thesaurus)</w:t>
       </w:r>
     </w:p>
     <w:p>
@@ -928,22 +921,13 @@
         <w:t>, para</w:t>
       </w:r>
       <w:r>
-        <w:t xml:space="preserve"> ello </w:t>
-      </w:r>
-      <w:r>
-        <w:t>se realizaron lecturas críticas, resúmenes y reflexiones de los artículos</w:t>
-      </w:r>
-      <w:r>
-        <w:t>, identificando</w:t>
+        <w:t xml:space="preserve"> ello se realizaron lecturas críticas, resúmenes y reflexiones de los artículos, identificando</w:t>
       </w:r>
       <w:r>
         <w:t xml:space="preserve"> ahí mismo</w:t>
       </w:r>
       <w:r>
-        <w:t xml:space="preserve"> la </w:t>
-      </w:r>
-      <w:r>
-        <w:t xml:space="preserve">separación de responsabilidades, mantenibilidad y </w:t>
+        <w:t xml:space="preserve"> la separación de responsabilidades, mantenibilidad y </w:t>
       </w:r>
       <w:r>
         <w:t xml:space="preserve">el </w:t>
@@ -961,10 +945,7 @@
         </w:numPr>
       </w:pPr>
       <w:r>
-        <w:t>La evidencia encontrada reforzó la pertinencia de las decisiones iniciales del proyecto y aportó lineamientos prácticos para guiar el diseño e implementación del sistema</w:t>
-      </w:r>
-      <w:r>
-        <w:t>.</w:t>
+        <w:t>La evidencia encontrada reforzó la pertinencia de las decisiones iniciales del proyecto y aportó lineamientos prácticos para guiar el diseño e implementación del sistema.</w:t>
       </w:r>
     </w:p>
     <w:p>
@@ -1225,10 +1206,7 @@
         </w:rPr>
       </w:pPr>
       <w:r>
-        <w:t>Metodología Ágil Scrum</w:t>
-      </w:r>
-      <w:r>
-        <w:t>:</w:t>
+        <w:t>Metodología Ágil Scrum:</w:t>
       </w:r>
     </w:p>
     <w:p>
@@ -1486,13 +1464,7 @@
         <w:t xml:space="preserve"> </w:t>
       </w:r>
       <w:r>
-        <w:t xml:space="preserve">A partir de </w:t>
-      </w:r>
-      <w:r>
-        <w:t xml:space="preserve">esto </w:t>
-      </w:r>
-      <w:r>
-        <w:t xml:space="preserve">se obtuvieron resultados relevantes en tres planos: </w:t>
+        <w:t xml:space="preserve">A partir de esto se obtuvieron resultados relevantes en tres planos: </w:t>
       </w:r>
     </w:p>
     <w:p>
@@ -1515,13 +1487,7 @@
         <w:rPr>
           <w:rStyle w:val="Textoennegrita"/>
         </w:rPr>
-        <w:t>Resultados en la arquitectura y el desarrollo del sistema</w:t>
-      </w:r>
-      <w:r>
-        <w:rPr>
-          <w:rStyle w:val="Textoennegrita"/>
-        </w:rPr>
-        <w:t>:</w:t>
+        <w:t>Resultados en la arquitectura y el desarrollo del sistema:</w:t>
       </w:r>
     </w:p>
     <w:p>
@@ -1592,16 +1558,16 @@
       <w:r>
         <w:lastRenderedPageBreak/>
         <w:drawing>
-          <wp:anchor distT="0" distB="0" distL="114300" distR="114300" simplePos="0" relativeHeight="251658240" behindDoc="1" locked="0" layoutInCell="1" allowOverlap="1" wp14:anchorId="5E1703F3" wp14:editId="7142C426">
+          <wp:anchor distT="0" distB="0" distL="114300" distR="114300" simplePos="0" relativeHeight="251660288" behindDoc="1" locked="0" layoutInCell="1" allowOverlap="1" wp14:anchorId="183C7635" wp14:editId="1D7F38B1">
             <wp:simplePos x="0" y="0"/>
             <wp:positionH relativeFrom="margin">
-              <wp:posOffset>637952</wp:posOffset>
+              <wp:posOffset>661670</wp:posOffset>
             </wp:positionH>
             <wp:positionV relativeFrom="paragraph">
-              <wp:posOffset>-408379</wp:posOffset>
+              <wp:posOffset>-164333</wp:posOffset>
             </wp:positionV>
-            <wp:extent cx="4814741" cy="2232837"/>
-            <wp:effectExtent l="0" t="0" r="5080" b="0"/>
+            <wp:extent cx="4997669" cy="2270125"/>
+            <wp:effectExtent l="0" t="0" r="0" b="0"/>
             <wp:wrapNone/>
             <wp:docPr id="1" name="Imagen 1"/>
             <wp:cNvGraphicFramePr>
@@ -1629,7 +1595,7 @@
                   <pic:spPr>
                     <a:xfrm>
                       <a:off x="0" y="0"/>
-                      <a:ext cx="4824702" cy="2237456"/>
+                      <a:ext cx="4997669" cy="2270125"/>
                     </a:xfrm>
                     <a:prstGeom prst="rect">
                       <a:avLst/>
@@ -1682,13 +1648,7 @@
         <w:pStyle w:val="APASEPTIMA"/>
       </w:pPr>
       <w:r>
-        <w:t xml:space="preserve">En la Figura </w:t>
-      </w:r>
-      <w:r>
-        <w:t>1</w:t>
-      </w:r>
-      <w:r>
-        <w:t xml:space="preserve"> se ilustra la estructura de la arquitectura Modelo–Vista–Controlador (MVC) adoptada en el desarrollo del sistema de gestión de eventos.</w:t>
+        <w:t>En la Figura 1 se ilustra la estructura de la arquitectura Modelo–Vista–Controlador (MVC) adoptada en el desarrollo del sistema de gestión de eventos.</w:t>
       </w:r>
       <w:r>
         <w:t xml:space="preserve"> </w:t>
@@ -1778,18 +1738,18 @@
       <w:r>
         <w:lastRenderedPageBreak/>
         <w:drawing>
-          <wp:anchor distT="0" distB="0" distL="114300" distR="114300" simplePos="0" relativeHeight="251659264" behindDoc="1" locked="0" layoutInCell="1" allowOverlap="1" wp14:anchorId="6FF4197B" wp14:editId="21397E4E">
+          <wp:anchor distT="0" distB="0" distL="114300" distR="114300" simplePos="0" relativeHeight="251661312" behindDoc="1" locked="0" layoutInCell="1" allowOverlap="1" wp14:anchorId="53BF3121" wp14:editId="27E8CCC5">
             <wp:simplePos x="0" y="0"/>
-            <wp:positionH relativeFrom="margin">
-              <wp:align>right</wp:align>
+            <wp:positionH relativeFrom="column">
+              <wp:posOffset>457200</wp:posOffset>
             </wp:positionH>
             <wp:positionV relativeFrom="paragraph">
-              <wp:posOffset>-166843</wp:posOffset>
+              <wp:posOffset>-6175</wp:posOffset>
             </wp:positionV>
-            <wp:extent cx="5943600" cy="2574925"/>
-            <wp:effectExtent l="0" t="0" r="0" b="0"/>
+            <wp:extent cx="4210638" cy="2333951"/>
+            <wp:effectExtent l="0" t="0" r="0" b="9525"/>
             <wp:wrapNone/>
-            <wp:docPr id="4" name="Imagen 4"/>
+            <wp:docPr id="2" name="Imagen 2"/>
             <wp:cNvGraphicFramePr>
               <a:graphicFrameLocks xmlns:a="http://schemas.openxmlformats.org/drawingml/2006/main" noChangeAspect="1"/>
             </wp:cNvGraphicFramePr>
@@ -1815,7 +1775,7 @@
                   <pic:spPr>
                     <a:xfrm>
                       <a:off x="0" y="0"/>
-                      <a:ext cx="5943600" cy="2574925"/>
+                      <a:ext cx="4210638" cy="2333951"/>
                     </a:xfrm>
                     <a:prstGeom prst="rect">
                       <a:avLst/>
@@ -1868,15 +1828,35 @@
     <w:p>
       <w:pPr>
         <w:pStyle w:val="APASEPTIMA"/>
-      </w:pPr>
-      <w:r>
-        <w:t xml:space="preserve">En la Figura </w:t>
-      </w:r>
-      <w:r>
-        <w:t>2</w:t>
-      </w:r>
-      <w:r>
-        <w:t xml:space="preserve"> se observa el tablero de Trello empleado para la planificación y seguimiento de los sprints. Este recurso permitió visualizar las tareas pendientes, en progreso y completadas, facilitando la comunicación del equipo y el control de avances bajo la metodología ágil Scrum</w:t>
+        <w:rPr>
+          <w:lang w:eastAsia="es-CO"/>
+        </w:rPr>
+      </w:pPr>
+      <w:r>
+        <w:rPr>
+          <w:lang w:eastAsia="es-CO"/>
+        </w:rPr>
+        <w:t xml:space="preserve">En la figura 2 </w:t>
+      </w:r>
+      <w:r>
+        <w:rPr>
+          <w:lang w:eastAsia="es-CO"/>
+        </w:rPr>
+        <w:t xml:space="preserve">se observa el diagrama del ciclo de Scrum, específicamente del marco de trabajo Scrum que incluye las fases de un Sprint. Este esquema ilustra el proceso iterativo </w:t>
+      </w:r>
+      <w:proofErr w:type="spellStart"/>
+      <w:r>
+        <w:rPr>
+          <w:lang w:eastAsia="es-CO"/>
+        </w:rPr>
+        <w:t>y</w:t>
+      </w:r>
+      <w:proofErr w:type="spellEnd"/>
+      <w:r>
+        <w:rPr>
+          <w:lang w:eastAsia="es-CO"/>
+        </w:rPr>
+        <w:t xml:space="preserve"> incremental utilizado en el desarrollo del proyecto, permitiendo la adaptación a cambios y la entrega continua de valor.</w:t>
       </w:r>
     </w:p>
     <w:p>
@@ -4346,6 +4326,19 @@
 </file>
 
 <file path=customXml/item2.xml><?xml version="1.0" encoding="utf-8"?>
+<b:Sources xmlns:b="http://schemas.openxmlformats.org/officeDocument/2006/bibliography" xmlns="http://schemas.openxmlformats.org/officeDocument/2006/bibliography" SelectedStyle="\APASixthEditionOfficeOnline.xsl" StyleName="APA" Version="6"/>
+</file>
+
+<file path=customXml/item3.xml><?xml version="1.0" encoding="utf-8"?>
+<?mso-contentType ?>
+<FormTemplates xmlns="http://schemas.microsoft.com/sharepoint/v3/contenttype/forms">
+  <Display>DocumentLibraryForm</Display>
+  <Edit>DocumentLibraryForm</Edit>
+  <New>DocumentLibraryForm</New>
+</FormTemplates>
+</file>
+
+<file path=customXml/item4.xml><?xml version="1.0" encoding="utf-8"?>
 <ct:contentTypeSchema xmlns:ct="http://schemas.microsoft.com/office/2006/metadata/contentType" xmlns:ma="http://schemas.microsoft.com/office/2006/metadata/properties/metaAttributes" ct:_="" ma:_="" ma:contentTypeName="Document" ma:contentTypeID="0x010100264712C20C6A1844978AB0DC1C355E94" ma:contentTypeVersion="13" ma:contentTypeDescription="Create a new document." ma:contentTypeScope="" ma:versionID="50c07be3753f4140d5ecf9008979d1e0">
   <xsd:schema xmlns:xsd="http://www.w3.org/2001/XMLSchema" xmlns:xs="http://www.w3.org/2001/XMLSchema" xmlns:p="http://schemas.microsoft.com/office/2006/metadata/properties" xmlns:ns2="7952b4f4-1049-4a3f-aa79-adff50169ad2" xmlns:ns3="84c616fa-8832-4d27-9132-6fda4bbeb70a" targetNamespace="http://schemas.microsoft.com/office/2006/metadata/properties" ma:root="true" ma:fieldsID="e35264bee066acc6e07fb571f8860a6f" ns2:_="" ns3:_="">
     <xsd:import namespace="7952b4f4-1049-4a3f-aa79-adff50169ad2"/>
@@ -4552,19 +4545,6 @@
 </ct:contentTypeSchema>
 </file>
 
-<file path=customXml/item3.xml><?xml version="1.0" encoding="utf-8"?>
-<?mso-contentType ?>
-<FormTemplates xmlns="http://schemas.microsoft.com/sharepoint/v3/contenttype/forms">
-  <Display>DocumentLibraryForm</Display>
-  <Edit>DocumentLibraryForm</Edit>
-  <New>DocumentLibraryForm</New>
-</FormTemplates>
-</file>
-
-<file path=customXml/item4.xml><?xml version="1.0" encoding="utf-8"?>
-<b:Sources xmlns:b="http://schemas.openxmlformats.org/officeDocument/2006/bibliography" xmlns="http://schemas.openxmlformats.org/officeDocument/2006/bibliography" SelectedStyle="\APASixthEditionOfficeOnline.xsl" StyleName="APA" Version="6"/>
-</file>
-
 <file path=customXml/itemProps1.xml><?xml version="1.0" encoding="utf-8"?>
 <ds:datastoreItem xmlns:ds="http://schemas.openxmlformats.org/officeDocument/2006/customXml" ds:itemID="{35A660BC-41FF-46B5-9A98-D339B4784D81}">
   <ds:schemaRefs>
@@ -4577,6 +4557,22 @@
 </file>
 
 <file path=customXml/itemProps2.xml><?xml version="1.0" encoding="utf-8"?>
+<ds:datastoreItem xmlns:ds="http://schemas.openxmlformats.org/officeDocument/2006/customXml" ds:itemID="{041A08A3-03ED-49FF-B018-3951B7D25E4F}">
+  <ds:schemaRefs>
+    <ds:schemaRef ds:uri="http://schemas.openxmlformats.org/officeDocument/2006/bibliography"/>
+  </ds:schemaRefs>
+</ds:datastoreItem>
+</file>
+
+<file path=customXml/itemProps3.xml><?xml version="1.0" encoding="utf-8"?>
+<ds:datastoreItem xmlns:ds="http://schemas.openxmlformats.org/officeDocument/2006/customXml" ds:itemID="{D6BB1EE1-193F-418F-A33F-BB948D6DCA7D}">
+  <ds:schemaRefs>
+    <ds:schemaRef ds:uri="http://schemas.microsoft.com/sharepoint/v3/contenttype/forms"/>
+  </ds:schemaRefs>
+</ds:datastoreItem>
+</file>
+
+<file path=customXml/itemProps4.xml><?xml version="1.0" encoding="utf-8"?>
 <ds:datastoreItem xmlns:ds="http://schemas.openxmlformats.org/officeDocument/2006/customXml" ds:itemID="{F195AE1F-82E2-4D65-A26A-CF3E4D84B4AA}">
   <ds:schemaRefs>
     <ds:schemaRef ds:uri="http://schemas.microsoft.com/office/2006/metadata/contentType"/>
@@ -4593,20 +4589,4 @@
     <ds:schemaRef ds:uri="http://schemas.microsoft.com/internal/obd"/>
   </ds:schemaRefs>
 </ds:datastoreItem>
-</file>
-
-<file path=customXml/itemProps3.xml><?xml version="1.0" encoding="utf-8"?>
-<ds:datastoreItem xmlns:ds="http://schemas.openxmlformats.org/officeDocument/2006/customXml" ds:itemID="{D6BB1EE1-193F-418F-A33F-BB948D6DCA7D}">
-  <ds:schemaRefs>
-    <ds:schemaRef ds:uri="http://schemas.microsoft.com/sharepoint/v3/contenttype/forms"/>
-  </ds:schemaRefs>
-</ds:datastoreItem>
-</file>
-
-<file path=customXml/itemProps4.xml><?xml version="1.0" encoding="utf-8"?>
-<ds:datastoreItem xmlns:ds="http://schemas.openxmlformats.org/officeDocument/2006/customXml" ds:itemID="{041A08A3-03ED-49FF-B018-3951B7D25E4F}">
-  <ds:schemaRefs>
-    <ds:schemaRef ds:uri="http://schemas.openxmlformats.org/officeDocument/2006/bibliography"/>
-  </ds:schemaRefs>
-</ds:datastoreItem>
 </file>
</xml_diff>

<commit_message>
docs: some change in the world
</commit_message>
<xml_diff>
--- a/07-week/02-session/02-activity/Articulo de investigación.docx
+++ b/07-week/02-session/02-activity/Articulo de investigación.docx
@@ -1556,6 +1556,9 @@
         <w:pStyle w:val="APASEPTIMA"/>
       </w:pPr>
       <w:r>
+        <w:rPr>
+          <w:noProof/>
+        </w:rPr>
         <w:lastRenderedPageBreak/>
         <w:drawing>
           <wp:anchor distT="0" distB="0" distL="114300" distR="114300" simplePos="0" relativeHeight="251660288" behindDoc="1" locked="0" layoutInCell="1" allowOverlap="1" wp14:anchorId="183C7635" wp14:editId="1D7F38B1">
@@ -1736,6 +1739,9 @@
         <w:pStyle w:val="APASEPTIMA"/>
       </w:pPr>
       <w:r>
+        <w:rPr>
+          <w:noProof/>
+        </w:rPr>
         <w:lastRenderedPageBreak/>
         <w:drawing>
           <wp:anchor distT="0" distB="0" distL="114300" distR="114300" simplePos="0" relativeHeight="251661312" behindDoc="1" locked="0" layoutInCell="1" allowOverlap="1" wp14:anchorId="53BF3121" wp14:editId="27E8CCC5">
@@ -1822,7 +1828,7 @@
         <w:t xml:space="preserve">Figura 2. </w:t>
       </w:r>
       <w:r>
-        <w:t>Tablero trello</w:t>
+        <w:t>Ciclo de scrum</w:t>
       </w:r>
     </w:p>
     <w:p>
@@ -1842,21 +1848,7 @@
         <w:rPr>
           <w:lang w:eastAsia="es-CO"/>
         </w:rPr>
-        <w:t xml:space="preserve">se observa el diagrama del ciclo de Scrum, específicamente del marco de trabajo Scrum que incluye las fases de un Sprint. Este esquema ilustra el proceso iterativo </w:t>
-      </w:r>
-      <w:proofErr w:type="spellStart"/>
-      <w:r>
-        <w:rPr>
-          <w:lang w:eastAsia="es-CO"/>
-        </w:rPr>
-        <w:t>y</w:t>
-      </w:r>
-      <w:proofErr w:type="spellEnd"/>
-      <w:r>
-        <w:rPr>
-          <w:lang w:eastAsia="es-CO"/>
-        </w:rPr>
-        <w:t xml:space="preserve"> incremental utilizado en el desarrollo del proyecto, permitiendo la adaptación a cambios y la entrega continua de valor.</w:t>
+        <w:t>se observa el diagrama del ciclo de Scrum, específicamente del marco de trabajo Scrum que incluye las fases de un Sprint. Este esquema ilustra el proceso iterativo y incremental utilizado en el desarrollo del proyecto, permitiendo la adaptación a cambios y la entrega continua de valor.</w:t>
       </w:r>
     </w:p>
     <w:p>
@@ -4326,19 +4318,6 @@
 </file>
 
 <file path=customXml/item2.xml><?xml version="1.0" encoding="utf-8"?>
-<b:Sources xmlns:b="http://schemas.openxmlformats.org/officeDocument/2006/bibliography" xmlns="http://schemas.openxmlformats.org/officeDocument/2006/bibliography" SelectedStyle="\APASixthEditionOfficeOnline.xsl" StyleName="APA" Version="6"/>
-</file>
-
-<file path=customXml/item3.xml><?xml version="1.0" encoding="utf-8"?>
-<?mso-contentType ?>
-<FormTemplates xmlns="http://schemas.microsoft.com/sharepoint/v3/contenttype/forms">
-  <Display>DocumentLibraryForm</Display>
-  <Edit>DocumentLibraryForm</Edit>
-  <New>DocumentLibraryForm</New>
-</FormTemplates>
-</file>
-
-<file path=customXml/item4.xml><?xml version="1.0" encoding="utf-8"?>
 <ct:contentTypeSchema xmlns:ct="http://schemas.microsoft.com/office/2006/metadata/contentType" xmlns:ma="http://schemas.microsoft.com/office/2006/metadata/properties/metaAttributes" ct:_="" ma:_="" ma:contentTypeName="Document" ma:contentTypeID="0x010100264712C20C6A1844978AB0DC1C355E94" ma:contentTypeVersion="13" ma:contentTypeDescription="Create a new document." ma:contentTypeScope="" ma:versionID="50c07be3753f4140d5ecf9008979d1e0">
   <xsd:schema xmlns:xsd="http://www.w3.org/2001/XMLSchema" xmlns:xs="http://www.w3.org/2001/XMLSchema" xmlns:p="http://schemas.microsoft.com/office/2006/metadata/properties" xmlns:ns2="7952b4f4-1049-4a3f-aa79-adff50169ad2" xmlns:ns3="84c616fa-8832-4d27-9132-6fda4bbeb70a" targetNamespace="http://schemas.microsoft.com/office/2006/metadata/properties" ma:root="true" ma:fieldsID="e35264bee066acc6e07fb571f8860a6f" ns2:_="" ns3:_="">
     <xsd:import namespace="7952b4f4-1049-4a3f-aa79-adff50169ad2"/>
@@ -4545,6 +4524,19 @@
 </ct:contentTypeSchema>
 </file>
 
+<file path=customXml/item3.xml><?xml version="1.0" encoding="utf-8"?>
+<?mso-contentType ?>
+<FormTemplates xmlns="http://schemas.microsoft.com/sharepoint/v3/contenttype/forms">
+  <Display>DocumentLibraryForm</Display>
+  <Edit>DocumentLibraryForm</Edit>
+  <New>DocumentLibraryForm</New>
+</FormTemplates>
+</file>
+
+<file path=customXml/item4.xml><?xml version="1.0" encoding="utf-8"?>
+<b:Sources xmlns:b="http://schemas.openxmlformats.org/officeDocument/2006/bibliography" xmlns="http://schemas.openxmlformats.org/officeDocument/2006/bibliography" SelectedStyle="\APASixthEditionOfficeOnline.xsl" StyleName="APA" Version="6"/>
+</file>
+
 <file path=customXml/itemProps1.xml><?xml version="1.0" encoding="utf-8"?>
 <ds:datastoreItem xmlns:ds="http://schemas.openxmlformats.org/officeDocument/2006/customXml" ds:itemID="{35A660BC-41FF-46B5-9A98-D339B4784D81}">
   <ds:schemaRefs>
@@ -4557,22 +4549,6 @@
 </file>
 
 <file path=customXml/itemProps2.xml><?xml version="1.0" encoding="utf-8"?>
-<ds:datastoreItem xmlns:ds="http://schemas.openxmlformats.org/officeDocument/2006/customXml" ds:itemID="{041A08A3-03ED-49FF-B018-3951B7D25E4F}">
-  <ds:schemaRefs>
-    <ds:schemaRef ds:uri="http://schemas.openxmlformats.org/officeDocument/2006/bibliography"/>
-  </ds:schemaRefs>
-</ds:datastoreItem>
-</file>
-
-<file path=customXml/itemProps3.xml><?xml version="1.0" encoding="utf-8"?>
-<ds:datastoreItem xmlns:ds="http://schemas.openxmlformats.org/officeDocument/2006/customXml" ds:itemID="{D6BB1EE1-193F-418F-A33F-BB948D6DCA7D}">
-  <ds:schemaRefs>
-    <ds:schemaRef ds:uri="http://schemas.microsoft.com/sharepoint/v3/contenttype/forms"/>
-  </ds:schemaRefs>
-</ds:datastoreItem>
-</file>
-
-<file path=customXml/itemProps4.xml><?xml version="1.0" encoding="utf-8"?>
 <ds:datastoreItem xmlns:ds="http://schemas.openxmlformats.org/officeDocument/2006/customXml" ds:itemID="{F195AE1F-82E2-4D65-A26A-CF3E4D84B4AA}">
   <ds:schemaRefs>
     <ds:schemaRef ds:uri="http://schemas.microsoft.com/office/2006/metadata/contentType"/>
@@ -4589,4 +4565,20 @@
     <ds:schemaRef ds:uri="http://schemas.microsoft.com/internal/obd"/>
   </ds:schemaRefs>
 </ds:datastoreItem>
+</file>
+
+<file path=customXml/itemProps3.xml><?xml version="1.0" encoding="utf-8"?>
+<ds:datastoreItem xmlns:ds="http://schemas.openxmlformats.org/officeDocument/2006/customXml" ds:itemID="{D6BB1EE1-193F-418F-A33F-BB948D6DCA7D}">
+  <ds:schemaRefs>
+    <ds:schemaRef ds:uri="http://schemas.microsoft.com/sharepoint/v3/contenttype/forms"/>
+  </ds:schemaRefs>
+</ds:datastoreItem>
+</file>
+
+<file path=customXml/itemProps4.xml><?xml version="1.0" encoding="utf-8"?>
+<ds:datastoreItem xmlns:ds="http://schemas.openxmlformats.org/officeDocument/2006/customXml" ds:itemID="{041A08A3-03ED-49FF-B018-3951B7D25E4F}">
+  <ds:schemaRefs>
+    <ds:schemaRef ds:uri="http://schemas.openxmlformats.org/officeDocument/2006/bibliography"/>
+  </ds:schemaRefs>
+</ds:datastoreItem>
 </file>
</xml_diff>